<commit_message>
fix: correct report documents and add presentation details
</commit_message>
<xml_diff>
--- a/SmartTutor_Report.docx
+++ b/SmartTutor_Report.docx
@@ -1,6 +1,6 @@
 
 <file path=word/document.xml><?xml version="1.0" encoding="utf-8"?>
-<w:document xmlns:wpc="http://schemas.microsoft.com/office/word/2010/wordprocessingCanvas" xmlns:cx="http://schemas.microsoft.com/office/drawing/2014/chartex" xmlns:cx1="http://schemas.microsoft.com/office/drawing/2015/9/8/chartex" xmlns:cx2="http://schemas.microsoft.com/office/drawing/2015/10/21/chartex" xmlns:cx3="http://schemas.microsoft.com/office/drawing/2016/5/9/chartex" xmlns:cx4="http://schemas.microsoft.com/office/drawing/2016/5/10/chartex" xmlns:cx5="http://schemas.microsoft.com/office/drawing/2016/5/11/chartex" xmlns:cx6="http://schemas.microsoft.com/office/drawing/2016/5/12/chartex" xmlns:cx7="http://schemas.microsoft.com/office/drawing/2016/5/13/chartex" xmlns:cx8="http://schemas.microsoft.com/office/drawing/2016/5/14/chartex" xmlns:mc="http://schemas.openxmlformats.org/markup-compatibility/2006" xmlns:aink="http://schemas.microsoft.com/office/drawing/2016/ink" xmlns:am3d="http://schemas.microsoft.com/office/drawing/2017/model3d" xmlns:o="urn:schemas-microsoft-com:office:office" xmlns:oel="http://schemas.microsoft.com/office/2019/extlst" xmlns:r="http://schemas.openxmlformats.org/officeDocument/2006/relationships" xmlns:m="http://schemas.openxmlformats.org/officeDocument/2006/math" xmlns:v="urn:schemas-microsoft-com:vml" xmlns:wp14="http://schemas.microsoft.com/office/word/2010/wordprocessingDrawing" xmlns:wp="http://schemas.openxmlformats.org/drawingml/2006/wordprocessingDrawing" xmlns:w10="urn:schemas-microsoft-com:office:word" xmlns:w="http://schemas.openxmlformats.org/wordprocessingml/2006/main" xmlns:w14="http://schemas.microsoft.com/office/word/2010/wordml" xmlns:w15="http://schemas.microsoft.com/office/word/2012/wordml" xmlns:w16cex="http://schemas.microsoft.com/office/word/2018/wordml/cex" xmlns:w16cid="http://schemas.microsoft.com/office/word/2016/wordml/cid" xmlns:w16="http://schemas.microsoft.com/office/word/2018/wordml" xmlns:w16du="http://schemas.microsoft.com/office/word/2023/wordml/word16du" xmlns:w16sdtdh="http://schemas.microsoft.com/office/word/2020/wordml/sdtdatahash" xmlns:w16sdtfl="http://schemas.microsoft.com/office/word/2024/wordml/sdtformatlock" xmlns:w16se="http://schemas.microsoft.com/office/word/2015/wordml/symex" xmlns:wpg="http://schemas.microsoft.com/office/word/2010/wordprocessingGroup" xmlns:wpi="http://schemas.microsoft.com/office/word/2010/wordprocessingInk" xmlns:wne="http://schemas.microsoft.com/office/word/2006/wordml" xmlns:wps="http://schemas.microsoft.com/office/word/2010/wordprocessingShape" mc:Ignorable="w14 w15 w16se w16cid w16 w16cex w16sdtdh w16sdtfl w16du wp14">
+<w:document xmlns:wpc="http://schemas.microsoft.com/office/word/2010/wordprocessingCanvas" xmlns:cx="http://schemas.microsoft.com/office/drawing/2014/chartex" xmlns:cx1="http://schemas.microsoft.com/office/drawing/2015/9/8/chartex" xmlns:cx2="http://schemas.microsoft.com/office/drawing/2015/10/21/chartex" xmlns:cx3="http://schemas.microsoft.com/office/drawing/2016/5/9/chartex" xmlns:cx4="http://schemas.microsoft.com/office/drawing/2016/5/10/chartex" xmlns:cx5="http://schemas.microsoft.com/office/drawing/2016/5/11/chartex" xmlns:cx6="http://schemas.microsoft.com/office/drawing/2016/5/12/chartex" xmlns:cx7="http://schemas.microsoft.com/office/drawing/2016/5/13/chartex" xmlns:cx8="http://schemas.microsoft.com/office/drawing/2016/5/14/chartex" xmlns:mc="http://schemas.openxmlformats.org/markup-compatibility/2006" xmlns:aink="http://schemas.microsoft.com/office/drawing/2016/ink" xmlns:am3d="http://schemas.microsoft.com/office/drawing/2017/model3d" xmlns:o="urn:schemas-microsoft-com:office:office" xmlns:oel="http://schemas.microsoft.com/office/2019/extlst" xmlns:r="http://schemas.openxmlformats.org/officeDocument/2006/relationships" xmlns:m="http://schemas.openxmlformats.org/officeDocument/2006/math" xmlns:v="urn:schemas-microsoft-com:vml" xmlns:wp14="http://schemas.microsoft.com/office/word/2010/wordprocessingDrawing" xmlns:wp="http://schemas.openxmlformats.org/drawingml/2006/wordprocessingDrawing" xmlns:w10="urn:schemas-microsoft-com:office:word" xmlns:w="http://schemas.openxmlformats.org/wordprocessingml/2006/main" xmlns:w14="http://schemas.microsoft.com/office/word/2010/wordml" xmlns:w15="http://schemas.microsoft.com/office/word/2012/wordml" xmlns:w16cex="http://schemas.microsoft.com/office/word/2018/wordml/cex" xmlns:w16cid="http://schemas.microsoft.com/office/word/2016/wordml/cid" xmlns:w16="http://schemas.microsoft.com/office/word/2018/wordml" xmlns:w16sdtdh="http://schemas.microsoft.com/office/word/2020/wordml/sdtdatahash" xmlns:w16se="http://schemas.microsoft.com/office/word/2015/wordml/symex" xmlns:wpg="http://schemas.microsoft.com/office/word/2010/wordprocessingGroup" xmlns:wpi="http://schemas.microsoft.com/office/word/2010/wordprocessingInk" xmlns:wne="http://schemas.microsoft.com/office/word/2006/wordml" xmlns:wps="http://schemas.microsoft.com/office/word/2010/wordprocessingShape" mc:Ignorable="w14 w15 w16se w16cid w16 w16cex w16sdtdh wp14">
   <w:body>
     <w:p>
       <w:pPr>
@@ -59,7 +59,7 @@
         <w:spacing w:after="0" w:line="240" w:lineRule="auto"/>
         <w:jc w:val="center"/>
         <w:rPr>
-          <w:rFonts w:ascii="Times New Roman" w:hAnsi="Times New Roman" w:cs="Times New Roman" w:hint="eastAsia"/>
+          <w:rFonts w:ascii="Times New Roman" w:hAnsi="Times New Roman" w:cs="Times New Roman"/>
           <w:b/>
           <w:bCs/>
           <w:i/>
@@ -551,7 +551,7 @@
       <w:pPr>
         <w:spacing w:after="0" w:line="240" w:lineRule="auto"/>
         <w:rPr>
-          <w:rFonts w:ascii="Times New Roman" w:hAnsi="Times New Roman" w:cs="Times New Roman" w:hint="eastAsia"/>
+          <w:rFonts w:ascii="Times New Roman" w:hAnsi="Times New Roman" w:cs="Times New Roman"/>
         </w:rPr>
       </w:pPr>
       <w:r>
@@ -731,13 +731,12 @@
       <w:r>
         <w:rPr>
           <w:rFonts w:ascii="Times New Roman" w:hAnsi="Times New Roman" w:cs="Times New Roman"/>
-          <w:noProof/>
         </w:rPr>
         <w:drawing>
-          <wp:inline distT="0" distB="0" distL="0" distR="0" wp14:anchorId="6CF796D3" wp14:editId="397717D3">
-            <wp:extent cx="5051834" cy="1185728"/>
-            <wp:effectExtent l="0" t="0" r="0" b="0"/>
-            <wp:docPr id="1808560445" name="图片 11"/>
+          <wp:inline distT="0" distB="0" distL="0" distR="0" wp14:anchorId="4E4788D7" wp14:editId="160892D1">
+            <wp:extent cx="4986797" cy="1133061"/>
+            <wp:effectExtent l="0" t="0" r="4445" b="0"/>
+            <wp:docPr id="3" name="图片 3"/>
             <wp:cNvGraphicFramePr>
               <a:graphicFrameLocks xmlns:a="http://schemas.openxmlformats.org/drawingml/2006/main" noChangeAspect="1"/>
             </wp:cNvGraphicFramePr>
@@ -745,36 +744,23 @@
               <a:graphicData uri="http://schemas.openxmlformats.org/drawingml/2006/picture">
                 <pic:pic xmlns:pic="http://schemas.openxmlformats.org/drawingml/2006/picture">
                   <pic:nvPicPr>
-                    <pic:cNvPr id="0" name="Picture 36"/>
-                    <pic:cNvPicPr>
-                      <a:picLocks noChangeAspect="1" noChangeArrowheads="1"/>
-                    </pic:cNvPicPr>
+                    <pic:cNvPr id="1" name=""/>
+                    <pic:cNvPicPr/>
                   </pic:nvPicPr>
                   <pic:blipFill>
-                    <a:blip r:embed="rId5" cstate="print">
-                      <a:extLst>
-                        <a:ext uri="{28A0092B-C50C-407E-A947-70E740481C1C}">
-                          <a14:useLocalDpi xmlns:a14="http://schemas.microsoft.com/office/drawing/2010/main" val="0"/>
-                        </a:ext>
-                      </a:extLst>
-                    </a:blip>
-                    <a:srcRect/>
+                    <a:blip r:embed="rId5"/>
                     <a:stretch>
                       <a:fillRect/>
                     </a:stretch>
                   </pic:blipFill>
-                  <pic:spPr bwMode="auto">
+                  <pic:spPr>
                     <a:xfrm>
                       <a:off x="0" y="0"/>
-                      <a:ext cx="5121977" cy="1202192"/>
+                      <a:ext cx="5127041" cy="1164926"/>
                     </a:xfrm>
                     <a:prstGeom prst="rect">
                       <a:avLst/>
                     </a:prstGeom>
-                    <a:noFill/>
-                    <a:ln>
-                      <a:noFill/>
-                    </a:ln>
                   </pic:spPr>
                 </pic:pic>
               </a:graphicData>
@@ -848,13 +834,12 @@
       <w:r>
         <w:rPr>
           <w:rFonts w:ascii="Times New Roman" w:hAnsi="Times New Roman" w:cs="Times New Roman"/>
-          <w:noProof/>
         </w:rPr>
         <w:drawing>
-          <wp:inline distT="0" distB="0" distL="0" distR="0" wp14:anchorId="77C7D1F8" wp14:editId="0E5AF5EA">
-            <wp:extent cx="5260340" cy="796925"/>
-            <wp:effectExtent l="0" t="0" r="0" b="3175"/>
-            <wp:docPr id="1491741838" name="图片 12"/>
+          <wp:inline distT="0" distB="0" distL="0" distR="0" wp14:anchorId="12024F40" wp14:editId="343DCCCC">
+            <wp:extent cx="5291593" cy="805924"/>
+            <wp:effectExtent l="0" t="0" r="4445" b="0"/>
+            <wp:docPr id="1" name="图片 1"/>
             <wp:cNvGraphicFramePr>
               <a:graphicFrameLocks xmlns:a="http://schemas.openxmlformats.org/drawingml/2006/main" noChangeAspect="1"/>
             </wp:cNvGraphicFramePr>
@@ -862,36 +847,23 @@
               <a:graphicData uri="http://schemas.openxmlformats.org/drawingml/2006/picture">
                 <pic:pic xmlns:pic="http://schemas.openxmlformats.org/drawingml/2006/picture">
                   <pic:nvPicPr>
-                    <pic:cNvPr id="0" name="Picture 37"/>
-                    <pic:cNvPicPr>
-                      <a:picLocks noChangeAspect="1" noChangeArrowheads="1"/>
-                    </pic:cNvPicPr>
+                    <pic:cNvPr id="1" name=""/>
+                    <pic:cNvPicPr/>
                   </pic:nvPicPr>
                   <pic:blipFill>
-                    <a:blip r:embed="rId6" cstate="print">
-                      <a:extLst>
-                        <a:ext uri="{28A0092B-C50C-407E-A947-70E740481C1C}">
-                          <a14:useLocalDpi xmlns:a14="http://schemas.microsoft.com/office/drawing/2010/main" val="0"/>
-                        </a:ext>
-                      </a:extLst>
-                    </a:blip>
-                    <a:srcRect/>
+                    <a:blip r:embed="rId6"/>
                     <a:stretch>
                       <a:fillRect/>
                     </a:stretch>
                   </pic:blipFill>
-                  <pic:spPr bwMode="auto">
+                  <pic:spPr>
                     <a:xfrm>
                       <a:off x="0" y="0"/>
-                      <a:ext cx="5260340" cy="796925"/>
+                      <a:ext cx="5344777" cy="814024"/>
                     </a:xfrm>
                     <a:prstGeom prst="rect">
                       <a:avLst/>
                     </a:prstGeom>
-                    <a:noFill/>
-                    <a:ln>
-                      <a:noFill/>
-                    </a:ln>
                   </pic:spPr>
                 </pic:pic>
               </a:graphicData>
@@ -929,7 +901,10 @@
         <w:rPr>
           <w:rFonts w:ascii="Times New Roman" w:hAnsi="Times New Roman" w:cs="Times New Roman"/>
         </w:rPr>
-        <w:t xml:space="preserve">User request: </w:t>
+        <w:t>User request:</w:t>
+      </w:r>
+      <w:r>
+        <w:t xml:space="preserve"> </w:t>
       </w:r>
       <w:r>
         <w:rPr>
@@ -939,16 +914,14 @@
         </w:rPr>
         <w:t xml:space="preserve">Can you </w:t>
       </w:r>
-      <w:proofErr w:type="spellStart"/>
-      <w:r>
-        <w:rPr>
-          <w:rFonts w:ascii="Times New Roman" w:hAnsi="Times New Roman" w:cs="Times New Roman"/>
-          <w:b/>
-          <w:bCs/>
-        </w:rPr>
-        <w:t>summarise</w:t>
-      </w:r>
-      <w:proofErr w:type="spellEnd"/>
+      <w:r>
+        <w:rPr>
+          <w:rFonts w:ascii="Times New Roman" w:hAnsi="Times New Roman" w:cs="Times New Roman"/>
+          <w:b/>
+          <w:bCs/>
+        </w:rPr>
+        <w:t>summarize</w:t>
+      </w:r>
       <w:r>
         <w:rPr>
           <w:rFonts w:ascii="Times New Roman" w:hAnsi="Times New Roman" w:cs="Times New Roman"/>
@@ -996,13 +969,12 @@
       <w:r>
         <w:rPr>
           <w:rFonts w:ascii="Times New Roman" w:hAnsi="Times New Roman" w:cs="Times New Roman"/>
-          <w:noProof/>
         </w:rPr>
         <w:drawing>
-          <wp:inline distT="0" distB="0" distL="0" distR="0" wp14:anchorId="6F1F701A" wp14:editId="58FD7414">
-            <wp:extent cx="5260340" cy="1991995"/>
-            <wp:effectExtent l="0" t="0" r="0" b="8255"/>
-            <wp:docPr id="1215602162" name="图片 13"/>
+          <wp:inline distT="0" distB="0" distL="0" distR="0" wp14:anchorId="107F2A13" wp14:editId="2B1373AD">
+            <wp:extent cx="5184250" cy="1452838"/>
+            <wp:effectExtent l="0" t="0" r="0" b="0"/>
+            <wp:docPr id="2" name="图片 2"/>
             <wp:cNvGraphicFramePr>
               <a:graphicFrameLocks xmlns:a="http://schemas.openxmlformats.org/drawingml/2006/main" noChangeAspect="1"/>
             </wp:cNvGraphicFramePr>
@@ -1010,36 +982,23 @@
               <a:graphicData uri="http://schemas.openxmlformats.org/drawingml/2006/picture">
                 <pic:pic xmlns:pic="http://schemas.openxmlformats.org/drawingml/2006/picture">
                   <pic:nvPicPr>
-                    <pic:cNvPr id="0" name="Picture 38"/>
-                    <pic:cNvPicPr>
-                      <a:picLocks noChangeAspect="1" noChangeArrowheads="1"/>
-                    </pic:cNvPicPr>
+                    <pic:cNvPr id="1" name=""/>
+                    <pic:cNvPicPr/>
                   </pic:nvPicPr>
                   <pic:blipFill>
-                    <a:blip r:embed="rId7" cstate="print">
-                      <a:extLst>
-                        <a:ext uri="{28A0092B-C50C-407E-A947-70E740481C1C}">
-                          <a14:useLocalDpi xmlns:a14="http://schemas.microsoft.com/office/drawing/2010/main" val="0"/>
-                        </a:ext>
-                      </a:extLst>
-                    </a:blip>
-                    <a:srcRect/>
+                    <a:blip r:embed="rId7"/>
                     <a:stretch>
                       <a:fillRect/>
                     </a:stretch>
                   </pic:blipFill>
-                  <pic:spPr bwMode="auto">
+                  <pic:spPr>
                     <a:xfrm>
                       <a:off x="0" y="0"/>
-                      <a:ext cx="5260340" cy="1991995"/>
+                      <a:ext cx="5216867" cy="1461979"/>
                     </a:xfrm>
                     <a:prstGeom prst="rect">
                       <a:avLst/>
                     </a:prstGeom>
-                    <a:noFill/>
-                    <a:ln>
-                      <a:noFill/>
-                    </a:ln>
                   </pic:spPr>
                 </pic:pic>
               </a:graphicData>
@@ -1231,7 +1190,7 @@
           <w:noProof/>
         </w:rPr>
         <w:drawing>
-          <wp:inline distT="0" distB="0" distL="0" distR="0" wp14:anchorId="51E84C34" wp14:editId="39B2D1D4">
+          <wp:inline distT="0" distB="0" distL="0" distR="0" wp14:anchorId="51E84C34" wp14:editId="41E6754B">
             <wp:extent cx="5264785" cy="733425"/>
             <wp:effectExtent l="0" t="0" r="0" b="9525"/>
             <wp:docPr id="575083932" name="图片 15"/>
@@ -1418,15 +1377,105 @@
       <w:pPr>
         <w:spacing w:after="0" w:line="240" w:lineRule="auto"/>
         <w:rPr>
+          <w:rFonts w:ascii="Times New Roman" w:hAnsi="Times New Roman" w:cs="Times New Roman"/>
+        </w:rPr>
+      </w:pPr>
+      <w:r>
+        <w:rPr>
+          <w:rFonts w:ascii="Times New Roman" w:hAnsi="Times New Roman" w:cs="Times New Roman"/>
+        </w:rPr>
+        <w:t>The current system is intentionally narrow in scope: it prioritizes reliable homework support over open-ended general chat. That tradeoff is appropriate for this course project, because it makes the agent easier to control, evaluate, and explain.</w:t>
+      </w:r>
+    </w:p>
+    <w:p>
+      <w:pPr>
+        <w:spacing w:after="0" w:line="240" w:lineRule="auto"/>
+        <w:rPr>
+          <w:rFonts w:ascii="Times New Roman" w:hAnsi="Times New Roman" w:cs="Times New Roman"/>
+          <w:b/>
+          <w:bCs/>
+          <w:sz w:val="24"/>
+        </w:rPr>
+      </w:pPr>
+      <w:r>
+        <w:rPr>
           <w:rFonts w:ascii="Times New Roman" w:hAnsi="Times New Roman" w:cs="Times New Roman" w:hint="eastAsia"/>
-        </w:rPr>
-      </w:pPr>
-      <w:r>
-        <w:rPr>
-          <w:rFonts w:ascii="Times New Roman" w:hAnsi="Times New Roman" w:cs="Times New Roman"/>
-        </w:rPr>
-        <w:t>The current system is intentionally narrow in scope: it prioritizes reliable homework support over open-ended general chat. That tradeoff is appropriate for this course project, because it makes the agent easier to control, evaluate, and explain.</w:t>
-      </w:r>
+          <w:b/>
+          <w:bCs/>
+          <w:sz w:val="24"/>
+        </w:rPr>
+        <w:t>6</w:t>
+      </w:r>
+      <w:r>
+        <w:rPr>
+          <w:rFonts w:ascii="Times New Roman" w:hAnsi="Times New Roman" w:cs="Times New Roman"/>
+          <w:b/>
+          <w:bCs/>
+          <w:sz w:val="24"/>
+        </w:rPr>
+        <w:t xml:space="preserve">. </w:t>
+      </w:r>
+      <w:r>
+        <w:rPr>
+          <w:rFonts w:ascii="Times New Roman" w:hAnsi="Times New Roman" w:cs="Times New Roman" w:hint="eastAsia"/>
+          <w:b/>
+          <w:bCs/>
+          <w:sz w:val="24"/>
+        </w:rPr>
+        <w:t>Presentation</w:t>
+      </w:r>
+    </w:p>
+    <w:p>
+      <w:pPr>
+        <w:spacing w:after="0" w:line="240" w:lineRule="auto"/>
+        <w:rPr>
+          <w:rFonts w:ascii="Times New Roman" w:hAnsi="Times New Roman" w:cs="Times New Roman" w:hint="eastAsia"/>
+          <w:sz w:val="24"/>
+        </w:rPr>
+      </w:pPr>
+      <w:r>
+        <w:rPr>
+          <w:rFonts w:ascii="Times New Roman" w:hAnsi="Times New Roman" w:cs="Times New Roman" w:hint="eastAsia"/>
+          <w:sz w:val="24"/>
+        </w:rPr>
+        <w:t xml:space="preserve">We would like to do </w:t>
+      </w:r>
+      <w:r>
+        <w:rPr>
+          <w:rFonts w:ascii="Times New Roman" w:hAnsi="Times New Roman" w:cs="Times New Roman"/>
+          <w:sz w:val="24"/>
+        </w:rPr>
+        <w:t>live demo and presentation</w:t>
+      </w:r>
+      <w:r>
+        <w:rPr>
+          <w:rFonts w:ascii="Times New Roman" w:hAnsi="Times New Roman" w:cs="Times New Roman" w:hint="eastAsia"/>
+          <w:sz w:val="24"/>
+        </w:rPr>
+        <w:t xml:space="preserve"> </w:t>
+      </w:r>
+      <w:r>
+        <w:rPr>
+          <w:rFonts w:ascii="Times New Roman" w:hAnsi="Times New Roman" w:cs="Times New Roman"/>
+          <w:sz w:val="24"/>
+        </w:rPr>
+        <w:t>on Saturday, March 28, 2026</w:t>
+      </w:r>
+      <w:r>
+        <w:rPr>
+          <w:rFonts w:ascii="Times New Roman" w:hAnsi="Times New Roman" w:cs="Times New Roman" w:hint="eastAsia"/>
+          <w:sz w:val="24"/>
+        </w:rPr>
+        <w:t>.</w:t>
+      </w:r>
+    </w:p>
+    <w:p>
+      <w:pPr>
+        <w:spacing w:after="0" w:line="240" w:lineRule="auto"/>
+        <w:rPr>
+          <w:rFonts w:ascii="Times New Roman" w:hAnsi="Times New Roman" w:cs="Times New Roman"/>
+        </w:rPr>
+      </w:pPr>
     </w:p>
     <w:sectPr>
       <w:pgSz w:w="11906" w:h="16838"/>
@@ -1439,7 +1488,7 @@
 </file>
 
 <file path=word/numbering.xml><?xml version="1.0" encoding="utf-8"?>
-<w:numbering xmlns:wpc="http://schemas.microsoft.com/office/word/2010/wordprocessingCanvas" xmlns:cx="http://schemas.microsoft.com/office/drawing/2014/chartex" xmlns:cx1="http://schemas.microsoft.com/office/drawing/2015/9/8/chartex" xmlns:cx2="http://schemas.microsoft.com/office/drawing/2015/10/21/chartex" xmlns:cx3="http://schemas.microsoft.com/office/drawing/2016/5/9/chartex" xmlns:cx4="http://schemas.microsoft.com/office/drawing/2016/5/10/chartex" xmlns:cx5="http://schemas.microsoft.com/office/drawing/2016/5/11/chartex" xmlns:cx6="http://schemas.microsoft.com/office/drawing/2016/5/12/chartex" xmlns:cx7="http://schemas.microsoft.com/office/drawing/2016/5/13/chartex" xmlns:cx8="http://schemas.microsoft.com/office/drawing/2016/5/14/chartex" xmlns:mc="http://schemas.openxmlformats.org/markup-compatibility/2006" xmlns:aink="http://schemas.microsoft.com/office/drawing/2016/ink" xmlns:am3d="http://schemas.microsoft.com/office/drawing/2017/model3d" xmlns:o="urn:schemas-microsoft-com:office:office" xmlns:oel="http://schemas.microsoft.com/office/2019/extlst" xmlns:r="http://schemas.openxmlformats.org/officeDocument/2006/relationships" xmlns:m="http://schemas.openxmlformats.org/officeDocument/2006/math" xmlns:v="urn:schemas-microsoft-com:vml" xmlns:wp14="http://schemas.microsoft.com/office/word/2010/wordprocessingDrawing" xmlns:wp="http://schemas.openxmlformats.org/drawingml/2006/wordprocessingDrawing" xmlns:w10="urn:schemas-microsoft-com:office:word" xmlns:w="http://schemas.openxmlformats.org/wordprocessingml/2006/main" xmlns:w14="http://schemas.microsoft.com/office/word/2010/wordml" xmlns:w15="http://schemas.microsoft.com/office/word/2012/wordml" xmlns:w16cex="http://schemas.microsoft.com/office/word/2018/wordml/cex" xmlns:w16cid="http://schemas.microsoft.com/office/word/2016/wordml/cid" xmlns:w16="http://schemas.microsoft.com/office/word/2018/wordml" xmlns:w16du="http://schemas.microsoft.com/office/word/2023/wordml/word16du" xmlns:w16sdtdh="http://schemas.microsoft.com/office/word/2020/wordml/sdtdatahash" xmlns:w16sdtfl="http://schemas.microsoft.com/office/word/2024/wordml/sdtformatlock" xmlns:w16se="http://schemas.microsoft.com/office/word/2015/wordml/symex" xmlns:wpg="http://schemas.microsoft.com/office/word/2010/wordprocessingGroup" xmlns:wpi="http://schemas.microsoft.com/office/word/2010/wordprocessingInk" xmlns:wne="http://schemas.microsoft.com/office/word/2006/wordml" xmlns:wps="http://schemas.microsoft.com/office/word/2010/wordprocessingShape" mc:Ignorable="w14 w15 w16se w16cid w16 w16cex w16sdtdh w16sdtfl w16du wp14">
+<w:numbering xmlns:wpc="http://schemas.microsoft.com/office/word/2010/wordprocessingCanvas" xmlns:cx="http://schemas.microsoft.com/office/drawing/2014/chartex" xmlns:cx1="http://schemas.microsoft.com/office/drawing/2015/9/8/chartex" xmlns:cx2="http://schemas.microsoft.com/office/drawing/2015/10/21/chartex" xmlns:cx3="http://schemas.microsoft.com/office/drawing/2016/5/9/chartex" xmlns:cx4="http://schemas.microsoft.com/office/drawing/2016/5/10/chartex" xmlns:cx5="http://schemas.microsoft.com/office/drawing/2016/5/11/chartex" xmlns:cx6="http://schemas.microsoft.com/office/drawing/2016/5/12/chartex" xmlns:cx7="http://schemas.microsoft.com/office/drawing/2016/5/13/chartex" xmlns:cx8="http://schemas.microsoft.com/office/drawing/2016/5/14/chartex" xmlns:mc="http://schemas.openxmlformats.org/markup-compatibility/2006" xmlns:aink="http://schemas.microsoft.com/office/drawing/2016/ink" xmlns:am3d="http://schemas.microsoft.com/office/drawing/2017/model3d" xmlns:o="urn:schemas-microsoft-com:office:office" xmlns:oel="http://schemas.microsoft.com/office/2019/extlst" xmlns:r="http://schemas.openxmlformats.org/officeDocument/2006/relationships" xmlns:m="http://schemas.openxmlformats.org/officeDocument/2006/math" xmlns:v="urn:schemas-microsoft-com:vml" xmlns:wp14="http://schemas.microsoft.com/office/word/2010/wordprocessingDrawing" xmlns:wp="http://schemas.openxmlformats.org/drawingml/2006/wordprocessingDrawing" xmlns:w10="urn:schemas-microsoft-com:office:word" xmlns:w="http://schemas.openxmlformats.org/wordprocessingml/2006/main" xmlns:w14="http://schemas.microsoft.com/office/word/2010/wordml" xmlns:w15="http://schemas.microsoft.com/office/word/2012/wordml" xmlns:w16cex="http://schemas.microsoft.com/office/word/2018/wordml/cex" xmlns:w16cid="http://schemas.microsoft.com/office/word/2016/wordml/cid" xmlns:w16="http://schemas.microsoft.com/office/word/2018/wordml" xmlns:w16sdtdh="http://schemas.microsoft.com/office/word/2020/wordml/sdtdatahash" xmlns:w16se="http://schemas.microsoft.com/office/word/2015/wordml/symex" xmlns:wpg="http://schemas.microsoft.com/office/word/2010/wordprocessingGroup" xmlns:wpi="http://schemas.microsoft.com/office/word/2010/wordprocessingInk" xmlns:wne="http://schemas.microsoft.com/office/word/2006/wordml" xmlns:wps="http://schemas.microsoft.com/office/word/2010/wordprocessingShape" mc:Ignorable="w14 w15 w16se w16cid w16 w16cex w16sdtdh wp14">
   <w:abstractNum w:abstractNumId="0" w15:restartNumberingAfterBreak="0">
     <w:nsid w:val="52B37024"/>
     <w:multiLevelType w:val="multilevel"/>
@@ -1748,7 +1797,7 @@
 </file>
 
 <file path=word/styles.xml><?xml version="1.0" encoding="utf-8"?>
-<w:styles xmlns:mc="http://schemas.openxmlformats.org/markup-compatibility/2006" xmlns:r="http://schemas.openxmlformats.org/officeDocument/2006/relationships" xmlns:w="http://schemas.openxmlformats.org/wordprocessingml/2006/main" xmlns:w14="http://schemas.microsoft.com/office/word/2010/wordml" xmlns:w15="http://schemas.microsoft.com/office/word/2012/wordml" xmlns:w16cex="http://schemas.microsoft.com/office/word/2018/wordml/cex" xmlns:w16cid="http://schemas.microsoft.com/office/word/2016/wordml/cid" xmlns:w16="http://schemas.microsoft.com/office/word/2018/wordml" xmlns:w16du="http://schemas.microsoft.com/office/word/2023/wordml/word16du" xmlns:w16sdtdh="http://schemas.microsoft.com/office/word/2020/wordml/sdtdatahash" xmlns:w16sdtfl="http://schemas.microsoft.com/office/word/2024/wordml/sdtformatlock" xmlns:w16se="http://schemas.microsoft.com/office/word/2015/wordml/symex" mc:Ignorable="w14 w15 w16se w16cid w16 w16cex w16sdtdh w16sdtfl w16du">
+<w:styles xmlns:mc="http://schemas.openxmlformats.org/markup-compatibility/2006" xmlns:r="http://schemas.openxmlformats.org/officeDocument/2006/relationships" xmlns:w="http://schemas.openxmlformats.org/wordprocessingml/2006/main" xmlns:w14="http://schemas.microsoft.com/office/word/2010/wordml" xmlns:w15="http://schemas.microsoft.com/office/word/2012/wordml" xmlns:w16cex="http://schemas.microsoft.com/office/word/2018/wordml/cex" xmlns:w16cid="http://schemas.microsoft.com/office/word/2016/wordml/cid" xmlns:w16="http://schemas.microsoft.com/office/word/2018/wordml" xmlns:w16sdtdh="http://schemas.microsoft.com/office/word/2020/wordml/sdtdatahash" xmlns:w16se="http://schemas.microsoft.com/office/word/2015/wordml/symex" mc:Ignorable="w14 w15 w16se w16cid w16 w16cex w16sdtdh">
   <w:docDefaults>
     <w:rPrDefault>
       <w:rPr>
@@ -2147,6 +2196,7 @@
   <w:style w:type="paragraph" w:default="1" w:styleId="a">
     <w:name w:val="Normal"/>
     <w:qFormat/>
+    <w:rsid w:val="00A34514"/>
     <w:pPr>
       <w:widowControl w:val="0"/>
     </w:pPr>

</xml_diff>